<commit_message>
Thuyết minh chi tiết (từng hiện vật): kremlin, moscow-city-panorama360, pushkin-museum [nhóm C]
Co-Authored-By: Claude Opus 4.8 <noreply@anthropic.com>
Claude-Session: https://claude.ai/code/session_01D96BQZ3V7WGXNk9azkj3jG
</commit_message>
<xml_diff>
--- a/tai-lieu-noi-bo/moscow/kremlin.docx
+++ b/tai-lieu-noi-bo/moscow/kremlin.docx
@@ -96,6 +96,14 @@
       </w:pPr>
       <w:r>
         <w:t>Di sản Thế giới UNESCO (cùng Quảng trường Đỏ) từ năm 1990.</w:t>
+      </w:r>
+    </w:p>
+    <w:p>
+      <w:pPr>
+        <w:pStyle w:val="ListBullet"/>
+      </w:pPr>
+      <w:r>
+        <w:t>20 tòa tháp (Troitskaya cao 80 m, Spasskaya 71 m), 5 ngôi sao hồng ngọc (1937) và đồng hồ chuông Spasskaya (куранты) điểm giao thừa nước Nga.</w:t>
       </w:r>
     </w:p>
     <w:p>
@@ -375,6 +383,240 @@
       </w:pPr>
       <w:r>
         <w:t>Ngoài bộ ba thánh đường lớn, du khách yêu kiến trúc tôn giáo có thể ghé Cung điện Thượng phụ cùng Nhà thờ Mười Hai Sứ đồ (giữa thế kỷ 17) ở rìa Quảng trường Nhà thờ, nơi trưng bày đời sống nghi lễ và sinh hoạt của giới giáo phẩm cấp cao. Vào một số mùa nhất định, phần thân dưới của Tháp chuông Ivan Đại đế còn mở khu trưng bày về lịch sử kiến trúc Kremlin, mang lại góc nhìn cận cảnh hiếm có về cách toà thành được dựng nên qua các thế kỷ.</w:t>
+      </w:r>
+    </w:p>
+    <w:p>
+      <w:pPr>
+        <w:pStyle w:val="Heading1"/>
+      </w:pPr>
+      <w:r>
+        <w:rPr>
+          <w:color w:val="152C4E"/>
+        </w:rPr>
+        <w:t>Tường thành &amp; hai mươi tòa tháp — đọc vị từng ngọn tháp</w:t>
+      </w:r>
+    </w:p>
+    <w:p>
+      <w:pPr>
+        <w:jc w:val="both"/>
+      </w:pPr>
+      <w:r>
+        <w:t>Bức tường gạch đỏ hiện nay dài 2.235 m, cao từ 5 đến 19 m tùy địa hình và dày từ 3,5 đến 6,5 m, được các bậc thầy người Ý dựng trong khoảng 1485–1495. Ban đầu Kremlin có 18 tháp, đến thế kỷ 17 tăng lên hai mươi; đỉnh tường tạo hình răng cưa 'đuôi én' mang dáng dấp lâu đài vùng Bắc Ý. Một con số dễ nhớ để mở đầu: hơn 2,2 km tường thành, đúng 20 tòa tháp và không tháp nào giống tháp nào.</w:t>
+      </w:r>
+    </w:p>
+    <w:p>
+      <w:pPr>
+        <w:jc w:val="both"/>
+      </w:pPr>
+      <w:r>
+        <w:t>Tháp Spasskaya (Спасская — 'Tháp Đấng Cứu Thế') cao 71 m tính cả ngôi sao, do kiến trúc sư Pietro Antonio Solari dựng năm 1491. Ban đầu tháp mang tên Frolovskaya, đổi tên năm 1658 theo bức thánh tượng 'Spas Nerukotvorny' (Đấng Cứu Thế không do tay người vẽ) treo phía trên cổng. Ở mặt ngoài còn bức thánh tượng 'Spas Smolensky' thế kỷ 16, từng bị trát vữa phủ kín năm 1937 và mãi tới năm 2010 mới được phục hồi. Đây là cổng chính hướng ra Quảng trường Đỏ và là nơi đặt chiếc đồng hồ chuông trứ danh.</w:t>
+      </w:r>
+    </w:p>
+    <w:p>
+      <w:pPr>
+        <w:jc w:val="both"/>
+      </w:pPr>
+      <w:r>
+        <w:t>Tháp Trinity (Троицкая / Troitskaya) cao 80 m — tháp cao nhất Kremlin, hoàn thiện năm 1495 — và chính là lối vào của du khách. Nối với nó bằng một cây cầu đá bắc ngang nền Vườn Alexander là Tháp Kutafya (Кутафья) thấp lùn màu trắng: công trình chắn tiền tiêu (barbican) duy nhất còn sót lại của Kremlin, xưa canh giữ đầu cầu. Cặp Troitskaya–Kutafya vì thế là hai ngọn tháp mà đoàn chạm mặt đầu tiên khi vào thành.</w:t>
+      </w:r>
+    </w:p>
+    <w:p>
+      <w:pPr>
+        <w:jc w:val="both"/>
+      </w:pPr>
+      <w:r>
+        <w:t>Dọc chu vi còn nhiều tháp đáng chỉ tận nơi: Tháp Nikolskaya (Никольская) ở phía đông bắc là cổng thứ hai mở ra Quảng trường Đỏ; Tháp Borovitskaya (Боровицкая) phía tây nam nay là cổng của đoàn xe nghi lễ và cũng là lối dẫn vào kho báu Armoury; Tháp Vodovzvodnaya (Водовзводная) bên bờ sông xưa lắp máy đưa nước sông Moskva vào thành nên có tên nghĩa là 'dẫn nước'; Tháp Tainitskaya (Тайницкая) nhìn ra sông, theo sử liệu là tháp được khởi công đầu tiên (1485), có giếng kín và lối thoát ngầm nên mang tên 'bí mật'. Xen giữa còn có Tháp Tsarskaya nhỏ xíu (dựng năm 1680, tương truyền là chỗ Sa hoàng đứng nhìn ra quảng trường) và Tháp Nabatnaya từng treo chuông báo động.</w:t>
+      </w:r>
+    </w:p>
+    <w:p>
+      <w:pPr>
+        <w:jc w:val="both"/>
+      </w:pPr>
+      <w:r>
+        <w:t>Gợi ý cách kể cho khách Việt: thay vì đọc đủ tên 20 tháp (khách khó nhớ), hãy 'neo' vào ba tháp mà khách thật sự nhìn thấy và đi qua — Kutafya (tháp trắng lùn ta bước qua đầu tiên), Troitskaya (tháp cao nhất, cổng vào) và Spasskaya (tháp có đồng hồ, hình ảnh quen thuộc trên tivi đêm giao thừa) — rồi mới điểm thêm vài cái tên 'có nghề' như Vodovzvodnaya ('dẫn nước') hay Tainitskaya ('bí mật, có đường hầm'). Công thức 'ba tháp + vài giai thoại' giúp khách vừa dễ nhớ vừa thấy thú vị.</w:t>
+      </w:r>
+    </w:p>
+    <w:p>
+      <w:pPr>
+        <w:pStyle w:val="Heading1"/>
+      </w:pPr>
+      <w:r>
+        <w:rPr>
+          <w:color w:val="152C4E"/>
+        </w:rPr>
+        <w:t>Đồng hồ chuông Spasskaya (Куранты) — nhịp thời gian của nước Nga</w:t>
+      </w:r>
+    </w:p>
+    <w:p>
+      <w:pPr>
+        <w:jc w:val="both"/>
+      </w:pPr>
+      <w:r>
+        <w:t>Chiếc đồng hồ lớn trên Tháp Spasskaya — người Nga gọi là 'kuranty' (куранты) — là đồng hồ tháp nổi tiếng nhất nước Nga. Bộ máy hiện nay do anh em nhà Butenop chế tạo lại năm 1851. Mặt đồng hồ có đường kính 6,12 m; chữ số La Mã cao 0,72 m; kim giờ dài 2,97 m và kim phút dài 3,27 m — những con số khiến khách sững người khi biết chiếc đồng hồ 'to bằng cả gian nhà'. Bốn mặt đồng hồ quay ra bốn hướng, gắn với bộ chuông đặt trong tháp.</w:t>
+      </w:r>
+    </w:p>
+    <w:p>
+      <w:pPr>
+        <w:jc w:val="both"/>
+      </w:pPr>
+      <w:r>
+        <w:t>Bộ chuông nhạc điểm giai điệu theo giờ; qua các thời kỳ, giai điệu từng được thay đổi theo thể chế (thời Sa hoàng, thời Xô viết và nước Nga ngày nay). Chi tiết mà khách Việt dễ đồng cảm nhất: tiếng chuông Spasskaya điểm mười hai tiếng lúc nửa đêm giao thừa được truyền hình trực tiếp toàn quốc — đúng khoảnh khắc cả nước Nga nâng ly, chẳng khác gì thời khắc giao thừa thiêng liêng của người Việt.</w:t>
+      </w:r>
+    </w:p>
+    <w:p>
+      <w:pPr>
+        <w:jc w:val="both"/>
+      </w:pPr>
+      <w:r>
+        <w:t>Gợi ý cách kể cho khách Việt: đứng ở Quảng trường Đỏ, chỉ lên mặt đồng hồ và mời khách đoán đường kính, rồi tiết lộ con số 6,12 m — rộng hơn cả một gian phòng khách. Nối tiếp bằng câu chuyện hai bức thánh tượng 'Đấng Cứu Thế' ở cổng Spasskaya (một bức bị trát kín thời Xô viết, mãi năm 2010 mới lộ lại) để gói gọn cụm tường – tháp – đồng hồ thành một mạch kể liền lạc.</w:t>
+      </w:r>
+    </w:p>
+    <w:p>
+      <w:pPr>
+        <w:pStyle w:val="Heading1"/>
+      </w:pPr>
+      <w:r>
+        <w:rPr>
+          <w:color w:val="152C4E"/>
+        </w:rPr>
+        <w:t>Năm ngôi sao hồng ngọc — biểu tượng bầu trời đêm Moskva</w:t>
+      </w:r>
+    </w:p>
+    <w:p>
+      <w:pPr>
+        <w:jc w:val="both"/>
+      </w:pPr>
+      <w:r>
+        <w:t>Trên năm tòa tháp cao nhất — Spasskaya, Nikolskaya, Troitskaya, Borovitskaya và Vodovzvodnaya — là năm ngôi sao đỏ phát sáng, thay cho những con đại bàng hai đầu của chế độ Sa hoàng. Bộ sao kim loại đầu tiên được lắp ngày 25/10/1935; đến ngày 2/11/1937, chúng được thay bằng sao thủy tinh hồng ngọc như ta thấy hôm nay.</w:t>
+      </w:r>
+    </w:p>
+    <w:p>
+      <w:pPr>
+        <w:jc w:val="both"/>
+      </w:pPr>
+      <w:r>
+        <w:t>Mỗi ngôi sao ghép từ ba lớp kính (trắng sữa, trong suốt và đỏ hồng ngọc); sắc đỏ có được là nhờ pha vàng keo (colloidal gold) vào thủy tinh, còn bên trong thắp đèn sợi đốt nên sao sáng cả ngày lẫn đêm. Dù mỗi ngôi nặng khoảng 1 tấn, chúng vẫn xoay theo chiều gió như một chiếc chong chóng khổng lồ. Kích thước (khoảng cách giữa hai đầu cánh sao) khác nhau theo tháp: Vodovzvodnaya 3 m, Borovitskaya 3,2 m, Troitskaya 3,5 m, còn Nikolskaya và Spasskaya lớn nhất với 3,75 m.</w:t>
+      </w:r>
+    </w:p>
+    <w:p>
+      <w:pPr>
+        <w:jc w:val="both"/>
+      </w:pPr>
+      <w:r>
+        <w:t>Gợi ý cách kể cho khách Việt: hỏi khách 'ngôi sao trên đỉnh tháp to cỡ nào?' rồi tiết lộ cánh sao Spasskaya rộng tới 3,75 m — hơn cả chiều cao một tầng nhà — mà vẫn xoay được theo gió dù nặng cả tấn. Câu chuyện 'đổi đại bàng hai đầu (Sa hoàng) sang sao đỏ (Xô viết)' là cách gọn gàng nhất để chạm tới khúc quanh thế kỷ 20 mà không sa vào bình luận chính trị.</w:t>
+      </w:r>
+    </w:p>
+    <w:p>
+      <w:pPr>
+        <w:pStyle w:val="Heading1"/>
+      </w:pPr>
+      <w:r>
+        <w:rPr>
+          <w:color w:val="152C4E"/>
+        </w:rPr>
+        <w:t>Quảng trường Nhà thờ — thăm từng thánh đường</w:t>
+      </w:r>
+    </w:p>
+    <w:p>
+      <w:pPr>
+        <w:jc w:val="both"/>
+      </w:pPr>
+      <w:r>
+        <w:t>Nhà thờ Uspensky (Успенский — Dormition/Assumption) do kiến trúc sư người Ý Aristotele Fioravanti dựng năm 1475–1479: năm mái vòm, sáu trụ, năm hậu cung bằng đá trắng, được ví như 'nhà thờ mẹ' của nước Nga. Đây là nơi cử hành lễ đăng quang của mọi quân vương Nga từ năm 1547 (Ivan Bạo chúa — Sa hoàng đầu tiên) cho tới năm 1896. Gần cửa nam là 'Ngai Monomakh' (Мономахов трон) chạm gỗ năm 1551 cho Ivan IV. Nhà thờ cũng là nơi an nghỉ của phần lớn các Giáo trưởng (Metropolitan) và Thượng phụ (Patriarch) Chính thống giáo Nga; bên trong từng lưu giữ bức thánh tượng Thánh George thế kỷ 12 (Ivan IV mang từ Novgorod về năm 1561), và bức 'Đức Mẹ Vladimir' trứ danh được tôn kính tại đây từ năm 1395 đến 1919 (nay ở Phòng tranh Tretyakov).</w:t>
+      </w:r>
+    </w:p>
+    <w:p>
+      <w:pPr>
+        <w:jc w:val="both"/>
+      </w:pPr>
+      <w:r>
+        <w:t>Nhà thờ Tổng lãnh Thiên thần Arkhangelsky (Архангельский, 1505–1508, kiến trúc sư Aleviz Novy — 'Aleviz Người Mới') là lăng mộ hoàng gia của Moskva: 46 phần mộ chứa 53 người, mộ đá trắng khắc chữ Slav cổ. Tại đây yên nghỉ Ivan I Kalita, Dmitry Donskoy (người hùng trận Kulikovo), Ivan III Đại đế, Ivan IV Bạo chúa cùng con trai Ivan Ivanovich; vị Sa hoàng cuối cùng được chôn ở đây là Pyotr II (Peter II) — mất vì bệnh đậu mùa năm 1730 khi mới 14 tuổi. Các bà hoàng vốn được an táng ở Tu viện Thăng Thiên (Вознесенский); khi tu viện bị phá năm 1929, hài cốt của họ được chuyển về hầm mộ của nhà thờ này.</w:t>
+      </w:r>
+    </w:p>
+    <w:p>
+      <w:pPr>
+        <w:jc w:val="both"/>
+      </w:pPr>
+      <w:r>
+        <w:t>Nhà thờ Truyền Tin Blagoveshchensky (Благовещенский, 1484–1489) do các thợ cả vùng Pskov dựng, là nhà nguyện riêng của hoàng gia — nơi Sa hoàng làm lễ cưới và rửa tội cho con cái. Vách thánh tượng (iconostasis) quy tụ các icon thế kỷ 14–17, trong đó có tác phẩm của Andrei Rublev, Feofan Hy Lạp (Theophanes the Greek) và Prokhor — những bậc thầy vẽ icon vĩ đại nhất của Nga; phần bích họa do Theodosius thực hiện năm 1508. Tương truyền sàn nhà thờ được lát bằng đá mã não – jaspe quý.</w:t>
+      </w:r>
+    </w:p>
+    <w:p>
+      <w:pPr>
+        <w:jc w:val="both"/>
+      </w:pPr>
+      <w:r>
+        <w:t>Nép giữa các thánh đường lớn còn có Nhà thờ nhỏ Đặt Áo Đức Mẹ (Ризоположения — Deposition of the Robe), vốn là nhà nguyện của các Giáo trưởng. Gợi ý cách kể cho khách Việt: đừng để khách 'bội thực icon' — hãy gắn mỗi nhà thờ với một 'vai' duy nhất: Uspensky là nơi ĐĂNG QUANG, Arkhangelsky là nơi AN NGHỈ của các Sa hoàng, còn Blagoveshchensky là nhà nguyện RIÊNG (cưới hỏi, rửa tội). Ba từ khóa 'đăng quang – an nghỉ – riêng tư' giúp khách nhớ trọn cả cụm chỉ trong một câu.</w:t>
+      </w:r>
+    </w:p>
+    <w:p>
+      <w:pPr>
+        <w:pStyle w:val="Heading1"/>
+      </w:pPr>
+      <w:r>
+        <w:rPr>
+          <w:color w:val="152C4E"/>
+        </w:rPr>
+        <w:t>Tháp chuông Ivan Đại đế &amp; 'bộ ba kỷ lục'</w:t>
+      </w:r>
+    </w:p>
+    <w:p>
+      <w:pPr>
+        <w:jc w:val="both"/>
+      </w:pPr>
+      <w:r>
+        <w:t>Vươn cao 81 m giữa quần thể là Tháp chuông Ivan Đại đế (Колокольня «Иван Великий»), dựng năm 1505–1508 (tương truyền do kiến trúc sư người Ý Bon Fryazin thực hiện) và được nâng lên độ cao trọn vẹn dưới thời Boris Godunov năm 1600. Suốt gần bốn thế kỷ rưỡi, đây là công trình cao nhất Moskva (từ 1508 đến tận 1952); thời ấy còn có lệ bất thành văn rằng không công trình nào trong thành phố được phép cao hơn tháp chuông này. Tháp hiện treo 22 quả chuông và vào một số mùa còn mở khu trưng bày về lịch sử kiến trúc Kremlin ở phần thân dưới.</w:t>
+      </w:r>
+    </w:p>
+    <w:p>
+      <w:pPr>
+        <w:jc w:val="both"/>
+      </w:pPr>
+      <w:r>
+        <w:t>Ngay dưới chân tháp là hai 'người khổng lồ' mà khách nào cũng dừng lại chụp ảnh — Chuông Sa hoàng nặng khoảng 202 tấn (chưa từng ngân một tiếng) và Đại bác Sa hoàng nặng khoảng 40 tấn, cỡ nòng 890 mm (chưa từng khai hoả) — vốn đã được kể chi tiết ở mục 'Những điểm nhấn không thể bỏ lỡ'. Gợi ý cách kể cho khách Việt: gom cả ba thành một 'bộ ba kỷ lục' để khách chụp liền một mạch — tháp CAO nhất, chuông TO nhất, pháo cỡ nòng LỚN nhất — rồi chốt bằng một câu dí dỏm: người Nga xưa mê những thứ 'nhất thế giới', và đôi khi tầm vóc biểu tượng còn được coi trọng hơn cả công năng thực tế.</w:t>
+      </w:r>
+    </w:p>
+    <w:p>
+      <w:pPr>
+        <w:pStyle w:val="Heading1"/>
+      </w:pPr>
+      <w:r>
+        <w:rPr>
+          <w:color w:val="152C4E"/>
+        </w:rPr>
+        <w:t>Cung điện &amp; dinh thự trong thành — đi từng khối</w:t>
+      </w:r>
+    </w:p>
+    <w:p>
+      <w:pPr>
+        <w:jc w:val="both"/>
+      </w:pPr>
+      <w:r>
+        <w:t>Cung điện Đại Kremlin (Большой Кремлёвский дворец, 1839–1849, kiến trúc sư Konstantin Thon) là dinh nghi lễ chính, tốn 11 triệu rúp để xây và hơn một tỷ đô-la để trùng tu trong thập niên 1990. Bên trong là chuỗi đại sảnh khánh tiết mang tên các huân chương đế chế: Sảnh Thánh George (Georgievsky), Sảnh Thánh Andrew (Andreyevsky — sảnh ngai), Sảnh Thánh Vladimir, Sảnh Thánh Alexander và Sảnh Thánh Catherine — nay là nơi tổ chức các nghi lễ cấp nhà nước.</w:t>
+      </w:r>
+    </w:p>
+    <w:p>
+      <w:pPr>
+        <w:jc w:val="both"/>
+      </w:pPr>
+      <w:r>
+        <w:t>Cung điện Có Mặt (Грановитая палата — Palace of Facets, 1487–1491, do Marco Ruffo và Pietro Antonio Solari dựng) là công trình dân sự cổ nhất còn lại của Moskva; mặt tiền ốp đá vát cạnh hình kim cương đã tạo nên tên gọi của nó, và đây là đại sảnh yến tiệc – tiếp kiến nơi đặt ngai của các Sa hoàng. Kề bên, Cung điện Terem (Теремной дворец) lộng lẫy chủ yếu thành hình vào thế kỷ 17, là khu ở của hoàng gia.</w:t>
+      </w:r>
+    </w:p>
+    <w:p>
+      <w:pPr>
+        <w:jc w:val="both"/>
+      </w:pPr>
+      <w:r>
+        <w:t>Ở khu phía bắc, tòa Thượng viện (Сенат) mái vòm xanh do Matvey Kazakov dựng cuối thế kỷ 18 nay là nơi làm việc của Tổng thống Nga (khách chỉ ngắm từ xa). Tòa Arsenal (Kho vũ khí) khởi công năm 1701 dưới thời Pyotr Đại đế, dọc mặt tiền trưng bày hàng trăm khẩu đại bác, trong đó nhiều khẩu là chiến lợi phẩm thu được của quân Napoléon năm 1812. Đối lập hoàn toàn về phong cách là Cung điện Đại hội (State Kremlin Palace, 1959–1961, thời Khrushchev) bằng kính và bê tông — nơi hội họp, hòa nhạc và biểu diễn ballet.</w:t>
+      </w:r>
+    </w:p>
+    <w:p>
+      <w:pPr>
+        <w:jc w:val="both"/>
+      </w:pPr>
+      <w:r>
+        <w:t>Gợi ý cách kể cho khách Việt: phần lớn các cung điện này KHÔNG mở cho khách lẻ vào bên trong (là khu làm việc của nguyên thủ), nên hãy nói trước để khách không kỳ vọng, rồi dạy khách một mẹo 'đọc' kiến trúc: mái vòm vàng và đá trắng là của thời Sa hoàng, khối kính chữ nhật là của thời Xô viết, còn tòa mái vòm xanh có quốc kỳ bay là dinh Tổng thống. Chỉ một câu, khách đã 'đọc' được cả bức tranh nghìn năm trong vòng tường thành.</w:t>
       </w:r>
     </w:p>
     <w:p>
@@ -842,6 +1084,96 @@
       </w:r>
     </w:p>
     <w:p>
+      <w:r>
+        <w:rPr>
+          <w:sz w:val="22"/>
+        </w:rPr>
+        <w:t xml:space="preserve">• Wikipedia — Spasskaya Tower — </w:t>
+      </w:r>
+      <w:r>
+        <w:rPr>
+          <w:color w:val="204A86"/>
+          <w:sz w:val="20"/>
+        </w:rPr>
+        <w:t>https://en.wikipedia.org/wiki/Spasskaya_Tower</w:t>
+      </w:r>
+    </w:p>
+    <w:p>
+      <w:r>
+        <w:rPr>
+          <w:sz w:val="22"/>
+        </w:rPr>
+        <w:t xml:space="preserve">• Wikipedia — Kremlin Clock (Куранты) — </w:t>
+      </w:r>
+      <w:r>
+        <w:rPr>
+          <w:color w:val="204A86"/>
+          <w:sz w:val="20"/>
+        </w:rPr>
+        <w:t>https://en.wikipedia.org/wiki/Kremlin_Clock</w:t>
+      </w:r>
+    </w:p>
+    <w:p>
+      <w:r>
+        <w:rPr>
+          <w:sz w:val="22"/>
+        </w:rPr>
+        <w:t xml:space="preserve">• Wikipedia — Kremlin stars — </w:t>
+      </w:r>
+      <w:r>
+        <w:rPr>
+          <w:color w:val="204A86"/>
+          <w:sz w:val="20"/>
+        </w:rPr>
+        <w:t>https://en.wikipedia.org/wiki/Kremlin_stars</w:t>
+      </w:r>
+    </w:p>
+    <w:p>
+      <w:r>
+        <w:rPr>
+          <w:sz w:val="22"/>
+        </w:rPr>
+        <w:t xml:space="preserve">• Wikipedia — Dormition Cathedral, Moscow — </w:t>
+      </w:r>
+      <w:r>
+        <w:rPr>
+          <w:color w:val="204A86"/>
+          <w:sz w:val="20"/>
+        </w:rPr>
+        <w:t>https://en.wikipedia.org/wiki/Dormition_Cathedral,_Moscow</w:t>
+      </w:r>
+    </w:p>
+    <w:p>
+      <w:r>
+        <w:rPr>
+          <w:sz w:val="22"/>
+        </w:rPr>
+        <w:t xml:space="preserve">• Wikipedia — Cathedral of the Annunciation, Moscow — </w:t>
+      </w:r>
+      <w:r>
+        <w:rPr>
+          <w:color w:val="204A86"/>
+          <w:sz w:val="20"/>
+        </w:rPr>
+        <w:t>https://en.wikipedia.org/wiki/Cathedral_of_the_Annunciation,_Moscow</w:t>
+      </w:r>
+    </w:p>
+    <w:p>
+      <w:r>
+        <w:rPr>
+          <w:sz w:val="22"/>
+        </w:rPr>
+        <w:t xml:space="preserve">• Wikipedia — Ivan the Great Bell Tower — </w:t>
+      </w:r>
+      <w:r>
+        <w:rPr>
+          <w:color w:val="204A86"/>
+          <w:sz w:val="20"/>
+        </w:rPr>
+        <w:t>https://en.wikipedia.org/wiki/Ivan_the_Great_Bell_Tower</w:t>
+      </w:r>
+    </w:p>
+    <w:p>
       <w:pPr>
         <w:pStyle w:val="Heading2"/>
       </w:pPr>
@@ -909,11 +1241,38 @@
     <w:p>
       <w:r>
         <w:rPr>
+          <w:color w:val="5C6773"/>
+          <w:sz w:val="20"/>
+        </w:rPr>
+        <w:t>Wikipedia tiếng Anh — 'Moscow Kremlin' (tường 2.235 m, cao 5–19 m, dày 3,5–6,5 m; 18→20 tháp), 'Spasskaya Tower' (cao 71 m, xây 1491), 'Kremlin Clock' (đồng hồ 1851 của anh em Butenop, mặt Ø6,12 m, chữ số 0,72 m, kim 2,97/3,27 m), 'Kremlin stars' (5 tháp; kim loại 1935 → thủy tinh hồng ngọc 1937; ~1 tấn; kích thước 3–3,75 m).</w:t>
+      </w:r>
+    </w:p>
+    <w:p>
+      <w:r>
+        <w:rPr>
+          <w:color w:val="5C6773"/>
+          <w:sz w:val="20"/>
+        </w:rPr>
+        <w:t>Wikipedia tiếng Anh — 'Dormition Cathedral, Moscow' (Fioravanti 1475–1479; đăng quang 1547–1896; Ngai Monomakh 1551), 'Cathedral of the Annunciation, Moscow' (thợ Pskov 1484–1489; icon Rublev/Feofan/Prokhor), 'Ivan the Great Bell Tower' (81 m, 1505–1508, 22 chuông, cao nhất Moskva tới 1952).</w:t>
+      </w:r>
+    </w:p>
+    <w:p>
+      <w:r>
+        <w:rPr>
+          <w:color w:val="5C6773"/>
+          <w:sz w:val="20"/>
+        </w:rPr>
+        <w:t>unofficialroyalty.com — Nhà thờ Tổng lãnh Thiên thần: 46 phần mộ / 53 người; an táng từ Ivan Kalita, Dmitry Donskoy, Ivan III, Ivan IV tới Pyotr II (1730).</w:t>
+      </w:r>
+    </w:p>
+    <w:p>
+      <w:r>
+        <w:rPr>
           <w:i/>
           <w:color w:val="5C6773"/>
           <w:sz w:val="18"/>
         </w:rPr>
-        <w:t>Tài liệu nội bộ — không dùng cho mục đích public. Biên soạn nguyên gốc, có dẫn nguồn. Cập nhật 2026-08-11.</w:t>
+        <w:t>Tài liệu nội bộ — không dùng cho mục đích public. Biên soạn nguyên gốc, có dẫn nguồn. Cập nhật 2026-09-27.</w:t>
       </w:r>
     </w:p>
     <w:sectPr>

</xml_diff>